<commit_message>
Atualiza o roteiro de apresentação do DUAXIS, substituindo "gestor" por "usuário" para refletir melhor a interação com o sistema. Adiciona novos vídeos de login e permissões, além de implementar uma página inicial que redireciona para a tela de login. Melhora a estrutura do frontend com novas seções e ajustes de CSS para a interface de login e perfil do usuário, visando aprimorar a experiência do usuário ao acessar e interagir com o sistema.
</commit_message>
<xml_diff>
--- a/DOCUMENTOS/PITCH/Roteiro Duaxis - 05.10.docx
+++ b/DOCUMENTOS/PITCH/Roteiro Duaxis - 05.10.docx
@@ -55,47 +55,7 @@
           <w:color w:val="4A5568"/>
           <w:lang w:val="pt-BR"/>
         </w:rPr>
-        <w:t xml:space="preserve">5 </w:t>
-      </w:r>
-      <w:proofErr w:type="gramStart"/>
-      <w:r>
-        <w:rPr>
-          <w:rFonts w:ascii="Calibri" w:eastAsia="Calibri" w:hAnsi="Calibri"/>
-          <w:i/>
-          <w:color w:val="4A5568"/>
-          <w:lang w:val="pt-BR"/>
-        </w:rPr>
-        <w:t>participantes  ·</w:t>
-      </w:r>
-      <w:proofErr w:type="gramEnd"/>
-      <w:r>
-        <w:rPr>
-          <w:rFonts w:ascii="Calibri" w:eastAsia="Calibri" w:hAnsi="Calibri"/>
-          <w:i/>
-          <w:color w:val="4A5568"/>
-          <w:lang w:val="pt-BR"/>
-        </w:rPr>
-        <w:t xml:space="preserve">  9 a 11 </w:t>
-      </w:r>
-      <w:proofErr w:type="gramStart"/>
-      <w:r>
-        <w:rPr>
-          <w:rFonts w:ascii="Calibri" w:eastAsia="Calibri" w:hAnsi="Calibri"/>
-          <w:i/>
-          <w:color w:val="4A5568"/>
-          <w:lang w:val="pt-BR"/>
-        </w:rPr>
-        <w:t>minutos  ·</w:t>
-      </w:r>
-      <w:proofErr w:type="gramEnd"/>
-      <w:r>
-        <w:rPr>
-          <w:rFonts w:ascii="Calibri" w:eastAsia="Calibri" w:hAnsi="Calibri"/>
-          <w:i/>
-          <w:color w:val="4A5568"/>
-          <w:lang w:val="pt-BR"/>
-        </w:rPr>
-        <w:t xml:space="preserve">  banca acadêmica</w:t>
+        <w:t>5 participantes · 9 a 11 minutos · banca acadêmica</w:t>
       </w:r>
     </w:p>
     <w:p>
@@ -513,6 +473,22 @@
               <w:t>tecnologia</w:t>
             </w:r>
             <w:proofErr w:type="spellEnd"/>
+            <w:r>
+              <w:rPr>
+                <w:rFonts w:ascii="Calibri" w:hAnsi="Calibri"/>
+                <w:sz w:val="20"/>
+              </w:rPr>
+              <w:t xml:space="preserve"> + </w:t>
+            </w:r>
+            <w:proofErr w:type="spellStart"/>
+            <w:r>
+              <w:rPr>
+                <w:rFonts w:ascii="Calibri" w:hAnsi="Calibri"/>
+                <w:sz w:val="20"/>
+              </w:rPr>
+              <w:t>Segurança</w:t>
+            </w:r>
+            <w:proofErr w:type="spellEnd"/>
           </w:p>
         </w:tc>
         <w:tc>
@@ -1162,7 +1138,25 @@
           <w:color w:val="4A5568"/>
           <w:lang w:val="pt-BR"/>
         </w:rPr>
-        <w:t>É justamente essa distância entre os dados disponíveis e a decisão do gestor que o DUAXIS busca reduzir</w:t>
+        <w:t xml:space="preserve">É justamente essa distância entre os dados disponíveis e a decisão do </w:t>
+      </w:r>
+      <w:r>
+        <w:rPr>
+          <w:rFonts w:ascii="Calibri" w:eastAsia="Calibri" w:hAnsi="Calibri"/>
+          <w:i/>
+          <w:color w:val="4A5568"/>
+          <w:lang w:val="pt-BR"/>
+        </w:rPr>
+        <w:t>usuário</w:t>
+      </w:r>
+      <w:r>
+        <w:rPr>
+          <w:rFonts w:ascii="Calibri" w:eastAsia="Calibri" w:hAnsi="Calibri"/>
+          <w:i/>
+          <w:color w:val="4A5568"/>
+          <w:lang w:val="pt-BR"/>
+        </w:rPr>
+        <w:t xml:space="preserve"> que o DUAXIS busca reduzir</w:t>
       </w:r>
       <w:r>
         <w:rPr>
@@ -1525,7 +1519,25 @@
           <w:color w:val="4A5568"/>
           <w:lang w:val="pt-BR"/>
         </w:rPr>
-        <w:t xml:space="preserve">E o gestor pode interagir com essas informações utilizando </w:t>
+        <w:t xml:space="preserve">E o </w:t>
+      </w:r>
+      <w:r>
+        <w:rPr>
+          <w:rFonts w:ascii="Calibri" w:eastAsia="Calibri" w:hAnsi="Calibri"/>
+          <w:i/>
+          <w:color w:val="4A5568"/>
+          <w:lang w:val="pt-BR"/>
+        </w:rPr>
+        <w:t>usuário</w:t>
+      </w:r>
+      <w:r>
+        <w:rPr>
+          <w:rFonts w:ascii="Calibri" w:eastAsia="Calibri" w:hAnsi="Calibri"/>
+          <w:i/>
+          <w:color w:val="4A5568"/>
+          <w:lang w:val="pt-BR"/>
+        </w:rPr>
+        <w:t xml:space="preserve"> pode interagir com essas informações utilizando </w:t>
       </w:r>
       <w:r>
         <w:rPr>
@@ -1705,7 +1717,25 @@
           <w:color w:val="4A5568"/>
           <w:lang w:val="pt-BR"/>
         </w:rPr>
-        <w:t>E o gestor também pode ir além:</w:t>
+        <w:t xml:space="preserve">E o </w:t>
+      </w:r>
+      <w:r>
+        <w:rPr>
+          <w:rFonts w:ascii="Calibri" w:eastAsia="Calibri" w:hAnsi="Calibri"/>
+          <w:i/>
+          <w:color w:val="4A5568"/>
+          <w:lang w:val="pt-BR"/>
+        </w:rPr>
+        <w:t>usuário</w:t>
+      </w:r>
+      <w:r>
+        <w:rPr>
+          <w:rFonts w:ascii="Calibri" w:eastAsia="Calibri" w:hAnsi="Calibri"/>
+          <w:i/>
+          <w:color w:val="4A5568"/>
+          <w:lang w:val="pt-BR"/>
+        </w:rPr>
+        <w:t xml:space="preserve"> também pode ir além:</w:t>
       </w:r>
     </w:p>
     <w:p>
@@ -1857,7 +1887,25 @@
           <w:color w:val="4A5568"/>
           <w:lang w:val="pt-BR"/>
         </w:rPr>
-        <w:t>Mas para que o DUAXIS consiga fazer isso de forma confiável, precisamos entender o que existe por trás dessas respostas.</w:t>
+        <w:t xml:space="preserve">Mas para que o DUAXIS consiga fazer isso de forma confiável, </w:t>
+      </w:r>
+      <w:r>
+        <w:rPr>
+          <w:rFonts w:ascii="Calibri" w:eastAsia="Calibri" w:hAnsi="Calibri"/>
+          <w:i/>
+          <w:color w:val="4A5568"/>
+          <w:lang w:val="pt-BR"/>
+        </w:rPr>
+        <w:t xml:space="preserve">Vitória o que </w:t>
+      </w:r>
+      <w:r>
+        <w:rPr>
+          <w:rFonts w:ascii="Calibri" w:eastAsia="Calibri" w:hAnsi="Calibri"/>
+          <w:i/>
+          <w:color w:val="4A5568"/>
+          <w:lang w:val="pt-BR"/>
+        </w:rPr>
+        <w:t>precisamos entender o que existe por trás dessas respostas.</w:t>
       </w:r>
       <w:r>
         <w:rPr>
@@ -3020,7 +3068,29 @@
           <w:color w:val="1E3A5F"/>
           <w:lang w:val="pt-BR"/>
         </w:rPr>
-        <w:t>Este é o painel do gestor. A data está em 31 de julho de 2026, o último mês fechado desta demonstração.</w:t>
+        <w:t xml:space="preserve">Este é o painel do </w:t>
+      </w:r>
+      <w:r>
+        <w:rPr>
+          <w:rFonts w:ascii="Calibri" w:eastAsia="Calibri" w:hAnsi="Calibri"/>
+          <w:bCs/>
+          <w:i/>
+          <w:iCs/>
+          <w:color w:val="1E3A5F"/>
+          <w:lang w:val="pt-BR"/>
+        </w:rPr>
+        <w:t>usuário</w:t>
+      </w:r>
+      <w:r>
+        <w:rPr>
+          <w:rFonts w:ascii="Calibri" w:eastAsia="Calibri" w:hAnsi="Calibri"/>
+          <w:bCs/>
+          <w:i/>
+          <w:iCs/>
+          <w:color w:val="1E3A5F"/>
+          <w:lang w:val="pt-BR"/>
+        </w:rPr>
+        <w:t>. A data está em 31 de julho de 2026, o último mês fechado desta demonstração.</w:t>
       </w:r>
     </w:p>
     <w:p>
@@ -3201,7 +3271,7 @@
           <w:color w:val="1E3A5F"/>
           <w:lang w:val="pt-BR"/>
         </w:rPr>
-        <w:t>vamos simular três perguntas do gestor</w:t>
+        <w:t xml:space="preserve">vamos simular três perguntas </w:t>
       </w:r>
       <w:r>
         <w:rPr>
@@ -3212,6 +3282,17 @@
           <w:color w:val="1E3A5F"/>
           <w:lang w:val="pt-BR"/>
         </w:rPr>
+        <w:t>do usuário</w:t>
+      </w:r>
+      <w:r>
+        <w:rPr>
+          <w:rFonts w:ascii="Calibri" w:eastAsia="Calibri" w:hAnsi="Calibri"/>
+          <w:bCs/>
+          <w:i/>
+          <w:iCs/>
+          <w:color w:val="1E3A5F"/>
+          <w:lang w:val="pt-BR"/>
+        </w:rPr>
         <w:t>.</w:t>
       </w:r>
     </w:p>
@@ -3220,8 +3301,10 @@
         <w:spacing w:after="0" w:line="360" w:lineRule="auto"/>
         <w:rPr>
           <w:rFonts w:ascii="Calibri" w:eastAsia="Calibri" w:hAnsi="Calibri"/>
-          <w:i/>
-          <w:color w:val="4A5568"/>
+          <w:bCs/>
+          <w:i/>
+          <w:iCs/>
+          <w:color w:val="1E3A5F"/>
           <w:lang w:val="pt-BR"/>
         </w:rPr>
       </w:pPr>
@@ -3352,7 +3435,7 @@
           <w:color w:val="1E3A5F"/>
           <w:lang w:val="pt-BR"/>
         </w:rPr>
-        <w:t xml:space="preserve"> do gestor. O sistema monta o que aconteceu no dia; a IA só interpreta</w:t>
+        <w:t xml:space="preserve"> do </w:t>
       </w:r>
       <w:r>
         <w:rPr>
@@ -3363,8 +3446,177 @@
           <w:color w:val="1E3A5F"/>
           <w:lang w:val="pt-BR"/>
         </w:rPr>
+        <w:t>usuário</w:t>
+      </w:r>
+      <w:r>
+        <w:rPr>
+          <w:rFonts w:ascii="Calibri" w:eastAsia="Calibri" w:hAnsi="Calibri"/>
+          <w:bCs/>
+          <w:i/>
+          <w:iCs/>
+          <w:color w:val="1E3A5F"/>
+          <w:lang w:val="pt-BR"/>
+        </w:rPr>
+        <w:t>. O sistema monta o que aconteceu no dia; a IA só interpreta</w:t>
+      </w:r>
+      <w:r>
+        <w:rPr>
+          <w:rFonts w:ascii="Calibri" w:eastAsia="Calibri" w:hAnsi="Calibri"/>
+          <w:bCs/>
+          <w:i/>
+          <w:iCs/>
+          <w:color w:val="1E3A5F"/>
+          <w:lang w:val="pt-BR"/>
+        </w:rPr>
         <w:t>.</w:t>
       </w:r>
+      <w:r>
+        <w:rPr>
+          <w:rFonts w:ascii="Calibri" w:eastAsia="Calibri" w:hAnsi="Calibri"/>
+          <w:bCs/>
+          <w:i/>
+          <w:iCs/>
+          <w:color w:val="1E3A5F"/>
+          <w:lang w:val="pt-BR"/>
+        </w:rPr>
+        <w:br/>
+      </w:r>
+      <w:r>
+        <w:rPr>
+          <w:rFonts w:ascii="Calibri" w:eastAsia="Calibri" w:hAnsi="Calibri"/>
+          <w:bCs/>
+          <w:i/>
+          <w:iCs/>
+          <w:color w:val="1E3A5F"/>
+          <w:lang w:val="pt-BR"/>
+        </w:rPr>
+        <w:t xml:space="preserve">Hoje no mundo da </w:t>
+      </w:r>
+      <w:proofErr w:type="spellStart"/>
+      <w:r>
+        <w:rPr>
+          <w:rFonts w:ascii="Calibri" w:eastAsia="Calibri" w:hAnsi="Calibri"/>
+          <w:bCs/>
+          <w:i/>
+          <w:iCs/>
+          <w:color w:val="1E3A5F"/>
+          <w:lang w:val="pt-BR"/>
+        </w:rPr>
+        <w:t>Urban</w:t>
+      </w:r>
+      <w:proofErr w:type="spellEnd"/>
+      <w:r>
+        <w:rPr>
+          <w:rFonts w:ascii="Calibri" w:eastAsia="Calibri" w:hAnsi="Calibri"/>
+          <w:bCs/>
+          <w:i/>
+          <w:iCs/>
+          <w:color w:val="1E3A5F"/>
+          <w:lang w:val="pt-BR"/>
+        </w:rPr>
+        <w:t xml:space="preserve"> </w:t>
+      </w:r>
+      <w:proofErr w:type="spellStart"/>
+      <w:r>
+        <w:rPr>
+          <w:rFonts w:ascii="Calibri" w:eastAsia="Calibri" w:hAnsi="Calibri"/>
+          <w:bCs/>
+          <w:i/>
+          <w:iCs/>
+          <w:color w:val="1E3A5F"/>
+          <w:lang w:val="pt-BR"/>
+        </w:rPr>
+        <w:t>Style</w:t>
+      </w:r>
+      <w:proofErr w:type="spellEnd"/>
+      <w:r>
+        <w:rPr>
+          <w:rFonts w:ascii="Calibri" w:eastAsia="Calibri" w:hAnsi="Calibri"/>
+          <w:bCs/>
+          <w:i/>
+          <w:iCs/>
+          <w:color w:val="1E3A5F"/>
+          <w:lang w:val="pt-BR"/>
+        </w:rPr>
+        <w:t>, é 31 de julho de 2026. O</w:t>
+      </w:r>
+      <w:r>
+        <w:rPr>
+          <w:rFonts w:ascii="Calibri" w:eastAsia="Calibri" w:hAnsi="Calibri"/>
+          <w:bCs/>
+          <w:i/>
+          <w:iCs/>
+          <w:color w:val="1E3A5F"/>
+          <w:lang w:val="pt-BR"/>
+        </w:rPr>
+        <w:t xml:space="preserve">s valores </w:t>
+      </w:r>
+      <w:r>
+        <w:rPr>
+          <w:rFonts w:ascii="Calibri" w:eastAsia="Calibri" w:hAnsi="Calibri"/>
+          <w:bCs/>
+          <w:i/>
+          <w:iCs/>
+          <w:color w:val="1E3A5F"/>
+          <w:lang w:val="pt-BR"/>
+        </w:rPr>
+        <w:t>est</w:t>
+      </w:r>
+      <w:r>
+        <w:rPr>
+          <w:rFonts w:ascii="Calibri" w:eastAsia="Calibri" w:hAnsi="Calibri"/>
+          <w:bCs/>
+          <w:i/>
+          <w:iCs/>
+          <w:color w:val="1E3A5F"/>
+          <w:lang w:val="pt-BR"/>
+        </w:rPr>
+        <w:t>ão</w:t>
+      </w:r>
+      <w:r>
+        <w:rPr>
+          <w:rFonts w:ascii="Calibri" w:eastAsia="Calibri" w:hAnsi="Calibri"/>
+          <w:bCs/>
+          <w:i/>
+          <w:iCs/>
+          <w:color w:val="1E3A5F"/>
+          <w:lang w:val="pt-BR"/>
+        </w:rPr>
+        <w:t xml:space="preserve"> nos blocos.</w:t>
+      </w:r>
+      <w:r>
+        <w:rPr>
+          <w:rFonts w:ascii="Calibri" w:eastAsia="Calibri" w:hAnsi="Calibri"/>
+          <w:bCs/>
+          <w:i/>
+          <w:iCs/>
+          <w:color w:val="1E3A5F"/>
+          <w:lang w:val="pt-BR"/>
+        </w:rPr>
+        <w:t xml:space="preserve"> </w:t>
+      </w:r>
+      <w:r>
+        <w:rPr>
+          <w:rFonts w:ascii="Calibri" w:eastAsia="Calibri" w:hAnsi="Calibri"/>
+          <w:bCs/>
+          <w:i/>
+          <w:iCs/>
+          <w:color w:val="1E3A5F"/>
+          <w:lang w:val="pt-BR"/>
+        </w:rPr>
+        <w:t>Cada resposta na tela mostra de onde veio o número, o período, quantos registros entram na conta e o que essa análise não cobre, e tudo isso pode ser baixado em PDF.</w:t>
+      </w:r>
+    </w:p>
+    <w:p>
+      <w:pPr>
+        <w:spacing w:after="0" w:line="360" w:lineRule="auto"/>
+        <w:rPr>
+          <w:rFonts w:ascii="Calibri" w:eastAsia="Calibri" w:hAnsi="Calibri"/>
+          <w:bCs/>
+          <w:color w:val="1E3A5F"/>
+          <w:lang w:val="pt-BR"/>
+        </w:rPr>
+      </w:pPr>
       <w:r>
         <w:rPr>
           <w:rFonts w:ascii="Calibri" w:eastAsia="Calibri" w:hAnsi="Calibri"/>
@@ -3372,7 +3624,54 @@
           <w:color w:val="1E3A5F"/>
           <w:lang w:val="pt-BR"/>
         </w:rPr>
+        <w:t>Pergunta 2 — ~1:00</w:t>
+      </w:r>
+      <w:r>
+        <w:rPr>
+          <w:rFonts w:ascii="Calibri" w:eastAsia="Calibri" w:hAnsi="Calibri"/>
+          <w:b/>
+          <w:color w:val="1E3A5F"/>
+          <w:lang w:val="pt-BR"/>
+        </w:rPr>
         <w:br/>
+      </w:r>
+      <w:r>
+        <w:rPr>
+          <w:rFonts w:ascii="Calibri" w:eastAsia="Calibri" w:hAnsi="Calibri"/>
+          <w:b/>
+          <w:color w:val="1E3A5F"/>
+          <w:lang w:val="pt-BR"/>
+        </w:rPr>
+        <w:t xml:space="preserve">Um outro exemplo de pergunta: </w:t>
+      </w:r>
+      <w:r>
+        <w:rPr>
+          <w:rFonts w:ascii="Calibri" w:eastAsia="Calibri" w:hAnsi="Calibri"/>
+          <w:bCs/>
+          <w:color w:val="1E3A5F"/>
+          <w:lang w:val="pt-BR"/>
+        </w:rPr>
+        <w:t>Por que o lucro caiu em maio de 2026?</w:t>
+      </w:r>
+      <w:r>
+        <w:rPr>
+          <w:rFonts w:ascii="Calibri" w:eastAsia="Calibri" w:hAnsi="Calibri"/>
+          <w:b/>
+          <w:color w:val="1E3A5F"/>
+          <w:lang w:val="pt-BR"/>
+        </w:rPr>
+        <w:br/>
+        <w:t>[enquanto carrega</w:t>
+      </w:r>
+      <w:proofErr w:type="gramStart"/>
+      <w:r>
+        <w:rPr>
+          <w:rFonts w:ascii="Calibri" w:eastAsia="Calibri" w:hAnsi="Calibri"/>
+          <w:b/>
+          <w:color w:val="1E3A5F"/>
+          <w:lang w:val="pt-BR"/>
+        </w:rPr>
+        <w:t>] </w:t>
       </w:r>
       <w:r>
         <w:rPr>
@@ -3383,9 +3682,9 @@
           <w:color w:val="1E3A5F"/>
           <w:lang w:val="pt-BR"/>
         </w:rPr>
-        <w:t xml:space="preserve">Hoje no mundo da </w:t>
-      </w:r>
-      <w:proofErr w:type="spellStart"/>
+        <w:t>Aqui</w:t>
+      </w:r>
+      <w:proofErr w:type="gramEnd"/>
       <w:r>
         <w:rPr>
           <w:rFonts w:ascii="Calibri" w:eastAsia="Calibri" w:hAnsi="Calibri"/>
@@ -3395,9 +3694,8 @@
           <w:color w:val="1E3A5F"/>
           <w:lang w:val="pt-BR"/>
         </w:rPr>
-        <w:t>Urban</w:t>
-      </w:r>
-      <w:proofErr w:type="spellEnd"/>
+        <w:t xml:space="preserve"> não basta </w:t>
+      </w:r>
       <w:r>
         <w:rPr>
           <w:rFonts w:ascii="Calibri" w:eastAsia="Calibri" w:hAnsi="Calibri"/>
@@ -3407,9 +3705,8 @@
           <w:color w:val="1E3A5F"/>
           <w:lang w:val="pt-BR"/>
         </w:rPr>
-        <w:t xml:space="preserve"> </w:t>
-      </w:r>
-      <w:proofErr w:type="spellStart"/>
+        <w:t>responder que houve uma queda</w:t>
+      </w:r>
       <w:r>
         <w:rPr>
           <w:rFonts w:ascii="Calibri" w:eastAsia="Calibri" w:hAnsi="Calibri"/>
@@ -3419,9 +3716,27 @@
           <w:color w:val="1E3A5F"/>
           <w:lang w:val="pt-BR"/>
         </w:rPr>
-        <w:t>Style</w:t>
-      </w:r>
-      <w:proofErr w:type="spellEnd"/>
+        <w:t>. O sistema decompõe o que pesou no lucro.</w:t>
+      </w:r>
+      <w:r>
+        <w:rPr>
+          <w:rFonts w:ascii="Calibri" w:eastAsia="Calibri" w:hAnsi="Calibri"/>
+          <w:b/>
+          <w:color w:val="1E3A5F"/>
+          <w:lang w:val="pt-BR"/>
+        </w:rPr>
+        <w:br/>
+        <w:t>[apontar o resumo + as parcelas; não ler a lista inteira]</w:t>
+      </w:r>
+      <w:r>
+        <w:rPr>
+          <w:rFonts w:ascii="Calibri" w:eastAsia="Calibri" w:hAnsi="Calibri"/>
+          <w:b/>
+          <w:color w:val="1E3A5F"/>
+          <w:lang w:val="pt-BR"/>
+        </w:rPr>
+        <w:br/>
+      </w:r>
       <w:r>
         <w:rPr>
           <w:rFonts w:ascii="Calibri" w:eastAsia="Calibri" w:hAnsi="Calibri"/>
@@ -3431,7 +3746,7 @@
           <w:color w:val="1E3A5F"/>
           <w:lang w:val="pt-BR"/>
         </w:rPr>
-        <w:t>, é 31 de julho de 2026. O número está nos blocos.</w:t>
+        <w:t>A tela mostra o que contribuiu</w:t>
       </w:r>
       <w:r>
         <w:rPr>
@@ -3442,25 +3757,40 @@
           <w:color w:val="1E3A5F"/>
           <w:lang w:val="pt-BR"/>
         </w:rPr>
-        <w:t xml:space="preserve"> </w:t>
-      </w:r>
-      <w:r>
-        <w:rPr>
-          <w:rFonts w:ascii="Calibri" w:eastAsia="Calibri" w:hAnsi="Calibri"/>
-          <w:i/>
-          <w:color w:val="4A5568"/>
-          <w:lang w:val="pt-BR"/>
-        </w:rPr>
-        <w:t>Cada resposta na tela mostra de onde veio o número, o período, quantos registros entram na conta e o que essa análise não cobre</w:t>
-      </w:r>
-      <w:r>
-        <w:rPr>
-          <w:rFonts w:ascii="Calibri" w:eastAsia="Calibri" w:hAnsi="Calibri"/>
-          <w:i/>
-          <w:color w:val="4A5568"/>
-          <w:lang w:val="pt-BR"/>
-        </w:rPr>
-        <w:t>, e tudo isso pode ser baixado em PDF.</w:t>
+        <w:t xml:space="preserve"> e quais as recomendações, </w:t>
+      </w:r>
+      <w:r>
+        <w:rPr>
+          <w:rFonts w:ascii="Calibri" w:eastAsia="Calibri" w:hAnsi="Calibri"/>
+          <w:bCs/>
+          <w:i/>
+          <w:iCs/>
+          <w:color w:val="1E3A5F"/>
+          <w:lang w:val="pt-BR"/>
+        </w:rPr>
+        <w:t xml:space="preserve">não </w:t>
+      </w:r>
+      <w:r>
+        <w:rPr>
+          <w:rFonts w:ascii="Calibri" w:eastAsia="Calibri" w:hAnsi="Calibri"/>
+          <w:bCs/>
+          <w:i/>
+          <w:iCs/>
+          <w:color w:val="1E3A5F"/>
+          <w:lang w:val="pt-BR"/>
+        </w:rPr>
+        <w:t xml:space="preserve">é </w:t>
+      </w:r>
+      <w:r>
+        <w:rPr>
+          <w:rFonts w:ascii="Calibri" w:eastAsia="Calibri" w:hAnsi="Calibri"/>
+          <w:bCs/>
+          <w:i/>
+          <w:iCs/>
+          <w:color w:val="1E3A5F"/>
+          <w:lang w:val="pt-BR"/>
+        </w:rPr>
+        <w:t>um texto genérico.</w:t>
       </w:r>
     </w:p>
     <w:p>
@@ -3469,6 +3799,8 @@
         <w:rPr>
           <w:rFonts w:ascii="Calibri" w:eastAsia="Calibri" w:hAnsi="Calibri"/>
           <w:bCs/>
+          <w:i/>
+          <w:iCs/>
           <w:color w:val="1E3A5F"/>
           <w:lang w:val="pt-BR"/>
         </w:rPr>
@@ -3480,7 +3812,7 @@
           <w:color w:val="1E3A5F"/>
           <w:lang w:val="pt-BR"/>
         </w:rPr>
-        <w:t>Pergunta 2 — ~1:00</w:t>
+        <w:t>Pergunta 3 — ~1:15</w:t>
       </w:r>
       <w:r>
         <w:rPr>
@@ -3494,11 +3826,29 @@
       <w:r>
         <w:rPr>
           <w:rFonts w:ascii="Calibri" w:eastAsia="Calibri" w:hAnsi="Calibri"/>
+          <w:bCs/>
+          <w:color w:val="1E3A5F"/>
+          <w:lang w:val="pt-BR"/>
+        </w:rPr>
+        <w:t>Outra pergunta:</w:t>
+      </w:r>
+      <w:r>
+        <w:rPr>
+          <w:rFonts w:ascii="Calibri" w:eastAsia="Calibri" w:hAnsi="Calibri"/>
           <w:b/>
           <w:color w:val="1E3A5F"/>
           <w:lang w:val="pt-BR"/>
         </w:rPr>
-        <w:t>Exemplo:</w:t>
+        <w:t xml:space="preserve"> </w:t>
+      </w:r>
+      <w:r>
+        <w:rPr>
+          <w:rFonts w:ascii="Calibri" w:eastAsia="Calibri" w:hAnsi="Calibri"/>
+          <w:bCs/>
+          <w:color w:val="1E3A5F"/>
+          <w:lang w:val="pt-BR"/>
+        </w:rPr>
+        <w:t>Quais produtos precisam de reposição?</w:t>
       </w:r>
       <w:r>
         <w:rPr>
@@ -3507,17 +3857,10 @@
           <w:color w:val="1E3A5F"/>
           <w:lang w:val="pt-BR"/>
         </w:rPr>
-        <w:t> </w:t>
-      </w:r>
-      <w:r>
-        <w:rPr>
-          <w:rFonts w:ascii="Calibri" w:eastAsia="Calibri" w:hAnsi="Calibri"/>
-          <w:bCs/>
-          <w:color w:val="1E3A5F"/>
-          <w:lang w:val="pt-BR"/>
-        </w:rPr>
-        <w:t>Por que o lucro caiu em maio de 2026?</w:t>
-      </w:r>
+        <w:br/>
+        <w:t>[enquanto carrega</w:t>
+      </w:r>
+      <w:proofErr w:type="gramStart"/>
       <w:r>
         <w:rPr>
           <w:rFonts w:ascii="Calibri" w:eastAsia="Calibri" w:hAnsi="Calibri"/>
@@ -3525,10 +3868,75 @@
           <w:color w:val="1E3A5F"/>
           <w:lang w:val="pt-BR"/>
         </w:rPr>
-        <w:br/>
-        <w:t>[enquanto carrega</w:t>
-      </w:r>
-      <w:proofErr w:type="gramStart"/>
+        <w:t>] </w:t>
+      </w:r>
+      <w:r>
+        <w:rPr>
+          <w:rFonts w:ascii="Calibri" w:eastAsia="Calibri" w:hAnsi="Calibri"/>
+          <w:bCs/>
+          <w:i/>
+          <w:iCs/>
+          <w:color w:val="1E3A5F"/>
+          <w:lang w:val="pt-BR"/>
+        </w:rPr>
+        <w:t>Aqui</w:t>
+      </w:r>
+      <w:proofErr w:type="gramEnd"/>
+      <w:r>
+        <w:rPr>
+          <w:rFonts w:ascii="Calibri" w:eastAsia="Calibri" w:hAnsi="Calibri"/>
+          <w:bCs/>
+          <w:i/>
+          <w:iCs/>
+          <w:color w:val="1E3A5F"/>
+          <w:lang w:val="pt-BR"/>
+        </w:rPr>
+        <w:t xml:space="preserve"> olhamos para frente: o modelo estima demanda para sugerir reposição. É</w:t>
+      </w:r>
+      <w:r>
+        <w:rPr>
+          <w:rFonts w:ascii="Calibri" w:eastAsia="Calibri" w:hAnsi="Calibri"/>
+          <w:bCs/>
+          <w:i/>
+          <w:iCs/>
+          <w:color w:val="1E3A5F"/>
+          <w:lang w:val="pt-BR"/>
+        </w:rPr>
+        <w:t xml:space="preserve"> uma</w:t>
+      </w:r>
+      <w:r>
+        <w:rPr>
+          <w:rFonts w:ascii="Calibri" w:eastAsia="Calibri" w:hAnsi="Calibri"/>
+          <w:bCs/>
+          <w:i/>
+          <w:iCs/>
+          <w:color w:val="1E3A5F"/>
+          <w:lang w:val="pt-BR"/>
+        </w:rPr>
+        <w:t xml:space="preserve"> previsão, não </w:t>
+      </w:r>
+      <w:r>
+        <w:rPr>
+          <w:rFonts w:ascii="Calibri" w:eastAsia="Calibri" w:hAnsi="Calibri"/>
+          <w:bCs/>
+          <w:i/>
+          <w:iCs/>
+          <w:color w:val="1E3A5F"/>
+          <w:lang w:val="pt-BR"/>
+        </w:rPr>
+        <w:t xml:space="preserve">é </w:t>
+      </w:r>
+      <w:r>
+        <w:rPr>
+          <w:rFonts w:ascii="Calibri" w:eastAsia="Calibri" w:hAnsi="Calibri"/>
+          <w:bCs/>
+          <w:i/>
+          <w:iCs/>
+          <w:color w:val="1E3A5F"/>
+          <w:lang w:val="pt-BR"/>
+        </w:rPr>
+        <w:t>o faturamento.</w:t>
+      </w:r>
       <w:r>
         <w:rPr>
           <w:rFonts w:ascii="Calibri" w:eastAsia="Calibri" w:hAnsi="Calibri"/>
@@ -3536,7 +3944,17 @@
           <w:color w:val="1E3A5F"/>
           <w:lang w:val="pt-BR"/>
         </w:rPr>
-        <w:t>] </w:t>
+        <w:br/>
+        <w:t>[apontar 1–2 produtos da lista + o bloco de confiabilidade]</w:t>
+      </w:r>
+      <w:r>
+        <w:rPr>
+          <w:rFonts w:ascii="Calibri" w:eastAsia="Calibri" w:hAnsi="Calibri"/>
+          <w:b/>
+          <w:color w:val="1E3A5F"/>
+          <w:lang w:val="pt-BR"/>
+        </w:rPr>
+        <w:br/>
       </w:r>
       <w:r>
         <w:rPr>
@@ -3547,9 +3965,8 @@
           <w:color w:val="1E3A5F"/>
           <w:lang w:val="pt-BR"/>
         </w:rPr>
-        <w:t>Aqui</w:t>
-      </w:r>
-      <w:proofErr w:type="gramEnd"/>
+        <w:t xml:space="preserve">O </w:t>
+      </w:r>
       <w:r>
         <w:rPr>
           <w:rFonts w:ascii="Calibri" w:eastAsia="Calibri" w:hAnsi="Calibri"/>
@@ -3559,7 +3976,7 @@
           <w:color w:val="1E3A5F"/>
           <w:lang w:val="pt-BR"/>
         </w:rPr>
-        <w:t xml:space="preserve"> não basta </w:t>
+        <w:t>usuário</w:t>
       </w:r>
       <w:r>
         <w:rPr>
@@ -3570,7 +3987,7 @@
           <w:color w:val="1E3A5F"/>
           <w:lang w:val="pt-BR"/>
         </w:rPr>
-        <w:t>responder que houve uma queda</w:t>
+        <w:t xml:space="preserve"> </w:t>
       </w:r>
       <w:r>
         <w:rPr>
@@ -3581,26 +3998,7 @@
           <w:color w:val="1E3A5F"/>
           <w:lang w:val="pt-BR"/>
         </w:rPr>
-        <w:t>. O sistema decompõe o que pesou no lucro.</w:t>
-      </w:r>
-      <w:r>
-        <w:rPr>
-          <w:rFonts w:ascii="Calibri" w:eastAsia="Calibri" w:hAnsi="Calibri"/>
-          <w:b/>
-          <w:color w:val="1E3A5F"/>
-          <w:lang w:val="pt-BR"/>
-        </w:rPr>
-        <w:br/>
-        <w:t>[apontar o resumo + as parcelas; não ler a lista inteira]</w:t>
-      </w:r>
-      <w:r>
-        <w:rPr>
-          <w:rFonts w:ascii="Calibri" w:eastAsia="Calibri" w:hAnsi="Calibri"/>
-          <w:b/>
-          <w:color w:val="1E3A5F"/>
-          <w:lang w:val="pt-BR"/>
-        </w:rPr>
-        <w:br/>
+        <w:t xml:space="preserve">consegue visualizar </w:t>
       </w:r>
       <w:r>
         <w:rPr>
@@ -3611,7 +4009,7 @@
           <w:color w:val="1E3A5F"/>
           <w:lang w:val="pt-BR"/>
         </w:rPr>
-        <w:t>A tela mostra o que contribuiu</w:t>
+        <w:t>o qu</w:t>
       </w:r>
       <w:r>
         <w:rPr>
@@ -3622,7 +4020,7 @@
           <w:color w:val="1E3A5F"/>
           <w:lang w:val="pt-BR"/>
         </w:rPr>
-        <w:t xml:space="preserve"> e quais as recomendações, </w:t>
+        <w:t>e precisa</w:t>
       </w:r>
       <w:r>
         <w:rPr>
@@ -3633,7 +4031,7 @@
           <w:color w:val="1E3A5F"/>
           <w:lang w:val="pt-BR"/>
         </w:rPr>
-        <w:t xml:space="preserve">não </w:t>
+        <w:t xml:space="preserve"> repor e </w:t>
       </w:r>
       <w:r>
         <w:rPr>
@@ -3644,7 +4042,7 @@
           <w:color w:val="1E3A5F"/>
           <w:lang w:val="pt-BR"/>
         </w:rPr>
-        <w:t xml:space="preserve">é </w:t>
+        <w:t xml:space="preserve">qual </w:t>
       </w:r>
       <w:r>
         <w:rPr>
@@ -3655,158 +4053,7 @@
           <w:color w:val="1E3A5F"/>
           <w:lang w:val="pt-BR"/>
         </w:rPr>
-        <w:t>um texto genérico.</w:t>
-      </w:r>
-    </w:p>
-    <w:p>
-      <w:pPr>
-        <w:spacing w:after="0" w:line="360" w:lineRule="auto"/>
-        <w:rPr>
-          <w:rFonts w:ascii="Calibri" w:eastAsia="Calibri" w:hAnsi="Calibri"/>
-          <w:bCs/>
-          <w:color w:val="1E3A5F"/>
-          <w:lang w:val="pt-BR"/>
-        </w:rPr>
-      </w:pPr>
-      <w:r>
-        <w:rPr>
-          <w:rFonts w:ascii="Calibri" w:eastAsia="Calibri" w:hAnsi="Calibri"/>
-          <w:b/>
-          <w:color w:val="1E3A5F"/>
-          <w:lang w:val="pt-BR"/>
-        </w:rPr>
-        <w:t>Pergunta 3 — ~1:15</w:t>
-      </w:r>
-      <w:r>
-        <w:rPr>
-          <w:rFonts w:ascii="Calibri" w:eastAsia="Calibri" w:hAnsi="Calibri"/>
-          <w:b/>
-          <w:color w:val="1E3A5F"/>
-          <w:lang w:val="pt-BR"/>
-        </w:rPr>
-        <w:br/>
-      </w:r>
-      <w:r>
-        <w:rPr>
-          <w:rFonts w:ascii="Calibri" w:eastAsia="Calibri" w:hAnsi="Calibri"/>
-          <w:b/>
-          <w:color w:val="1E3A5F"/>
-          <w:lang w:val="pt-BR"/>
-        </w:rPr>
-        <w:t>Exemplo:</w:t>
-      </w:r>
-      <w:r>
-        <w:rPr>
-          <w:rFonts w:ascii="Calibri" w:eastAsia="Calibri" w:hAnsi="Calibri"/>
-          <w:b/>
-          <w:color w:val="1E3A5F"/>
-          <w:lang w:val="pt-BR"/>
-        </w:rPr>
-        <w:t> </w:t>
-      </w:r>
-      <w:r>
-        <w:rPr>
-          <w:rFonts w:ascii="Calibri" w:eastAsia="Calibri" w:hAnsi="Calibri"/>
-          <w:bCs/>
-          <w:color w:val="1E3A5F"/>
-          <w:lang w:val="pt-BR"/>
-        </w:rPr>
-        <w:t>Quais produtos precisam de reposição?</w:t>
-      </w:r>
-      <w:r>
-        <w:rPr>
-          <w:rFonts w:ascii="Calibri" w:eastAsia="Calibri" w:hAnsi="Calibri"/>
-          <w:b/>
-          <w:color w:val="1E3A5F"/>
-          <w:lang w:val="pt-BR"/>
-        </w:rPr>
-        <w:br/>
-        <w:t>[enquanto carrega</w:t>
-      </w:r>
-      <w:proofErr w:type="gramStart"/>
-      <w:r>
-        <w:rPr>
-          <w:rFonts w:ascii="Calibri" w:eastAsia="Calibri" w:hAnsi="Calibri"/>
-          <w:b/>
-          <w:color w:val="1E3A5F"/>
-          <w:lang w:val="pt-BR"/>
-        </w:rPr>
-        <w:t>] </w:t>
-      </w:r>
-      <w:r>
-        <w:rPr>
-          <w:rFonts w:ascii="Calibri" w:eastAsia="Calibri" w:hAnsi="Calibri"/>
-          <w:bCs/>
-          <w:i/>
-          <w:iCs/>
-          <w:color w:val="1E3A5F"/>
-          <w:lang w:val="pt-BR"/>
-        </w:rPr>
-        <w:t>Aqui</w:t>
-      </w:r>
-      <w:proofErr w:type="gramEnd"/>
-      <w:r>
-        <w:rPr>
-          <w:rFonts w:ascii="Calibri" w:eastAsia="Calibri" w:hAnsi="Calibri"/>
-          <w:bCs/>
-          <w:i/>
-          <w:iCs/>
-          <w:color w:val="1E3A5F"/>
-          <w:lang w:val="pt-BR"/>
-        </w:rPr>
-        <w:t xml:space="preserve"> olhamos para frente: o modelo estima demanda para sugerir reposição. É previsão, não o faturamento.</w:t>
-      </w:r>
-      <w:r>
-        <w:rPr>
-          <w:rFonts w:ascii="Calibri" w:eastAsia="Calibri" w:hAnsi="Calibri"/>
-          <w:b/>
-          <w:color w:val="1E3A5F"/>
-          <w:lang w:val="pt-BR"/>
-        </w:rPr>
-        <w:br/>
-        <w:t>[apontar 1–2 produtos da lista + o bloco de confiabilidade]</w:t>
-      </w:r>
-      <w:r>
-        <w:rPr>
-          <w:rFonts w:ascii="Calibri" w:eastAsia="Calibri" w:hAnsi="Calibri"/>
-          <w:b/>
-          <w:color w:val="1E3A5F"/>
-          <w:lang w:val="pt-BR"/>
-        </w:rPr>
-        <w:br/>
-      </w:r>
-      <w:r>
-        <w:rPr>
-          <w:rFonts w:ascii="Calibri" w:eastAsia="Calibri" w:hAnsi="Calibri"/>
-          <w:bCs/>
-          <w:i/>
-          <w:iCs/>
-          <w:color w:val="1E3A5F"/>
-          <w:lang w:val="pt-BR"/>
-        </w:rPr>
-        <w:t>O gestor vê o qu</w:t>
-      </w:r>
-      <w:r>
-        <w:rPr>
-          <w:rFonts w:ascii="Calibri" w:eastAsia="Calibri" w:hAnsi="Calibri"/>
-          <w:bCs/>
-          <w:i/>
-          <w:iCs/>
-          <w:color w:val="1E3A5F"/>
-          <w:lang w:val="pt-BR"/>
-        </w:rPr>
-        <w:t>e precisa</w:t>
-      </w:r>
-      <w:r>
-        <w:rPr>
-          <w:rFonts w:ascii="Calibri" w:eastAsia="Calibri" w:hAnsi="Calibri"/>
-          <w:bCs/>
-          <w:i/>
-          <w:iCs/>
-          <w:color w:val="1E3A5F"/>
-          <w:lang w:val="pt-BR"/>
-        </w:rPr>
-        <w:t xml:space="preserve"> repor e o critério</w:t>
+        <w:t>o critério</w:t>
       </w:r>
       <w:r>
         <w:rPr>
@@ -4138,7 +4385,25 @@
           <w:color w:val="4A5568"/>
           <w:lang w:val="pt-BR"/>
         </w:rPr>
-        <w:t>apoiar o gestor na tomada de decisão.</w:t>
+        <w:t xml:space="preserve">apoiar o </w:t>
+      </w:r>
+      <w:r>
+        <w:rPr>
+          <w:rFonts w:ascii="Calibri" w:eastAsia="Calibri" w:hAnsi="Calibri"/>
+          <w:i/>
+          <w:color w:val="4A5568"/>
+          <w:lang w:val="pt-BR"/>
+        </w:rPr>
+        <w:t>usuário</w:t>
+      </w:r>
+      <w:r>
+        <w:rPr>
+          <w:rFonts w:ascii="Calibri" w:eastAsia="Calibri" w:hAnsi="Calibri"/>
+          <w:i/>
+          <w:color w:val="4A5568"/>
+          <w:lang w:val="pt-BR"/>
+        </w:rPr>
+        <w:t xml:space="preserve"> na tomada de decisão.</w:t>
       </w:r>
     </w:p>
     <w:p>
@@ -4155,6 +4420,7 @@
           <w:color w:val="4A5568"/>
           <w:lang w:val="pt-BR"/>
         </w:rPr>
+        <w:lastRenderedPageBreak/>
         <w:t>Transição: “</w:t>
       </w:r>
       <w:r>
@@ -4191,7 +4457,6 @@
           <w:sz w:val="32"/>
           <w:lang w:val="pt-BR"/>
         </w:rPr>
-        <w:lastRenderedPageBreak/>
         <w:t>Participante 5 — Próximos passos + fechamento</w:t>
       </w:r>
       <w:r>
@@ -5621,6 +5886,7 @@
   <w:style w:type="character" w:default="1" w:styleId="Fontepargpadro">
     <w:name w:val="Default Paragraph Font"/>
     <w:uiPriority w:val="1"/>
+    <w:semiHidden/>
     <w:unhideWhenUsed/>
   </w:style>
   <w:style w:type="table" w:default="1" w:styleId="Tabelanormal">

</xml_diff>